<commit_message>
Uputstva za razumijevanje projekta i azurirana gradnja radova
</commit_message>
<xml_diff>
--- a/radovi/telfor2026/telfor2026_asd_esp32s3.docx
+++ b/radovi/telfor2026/telfor2026_asd_esp32s3.docx
@@ -81,7 +81,7 @@
         <w:t>Abstract—</w:t>
       </w:r>
       <w:r>
-        <w:t>Anomalous sound detection for machine condition monitoring is almost always evaluated as an offline benchmark. This paper reports what changes when the same statistical detector is moved onto a microcontroller and required to calibrate itself, in the field, on one machine, from normal sound only. The device is an ESP32-S3 with a single MEMS microphone: a Welch power spectral density front end, a Ledoit-Wolf Mahalanobis score, and a local centre learned in about 115 s from ten calibration windows. Every operating policy - audio quality gate, machine-presence gate, temporal decision rule and threshold - is derived without reading a single anomalous recording. With ten calibration windows, we report a developmental AUC of 0.856 on the DCASE 2026 fan data and 716 ms of computation per 10 s window. On a physical fan the device learns the normal state of a machine it has never heard, derives its own threshold from a normal-only period, verifies that threshold on a later normal-only period, and reports a sustained acoustic change while rejecting speech and door noise as unreliable rather than interpreting them. An earlier version of the same system produced thresholds differing by a factor of 16 across repeated calibrations of the same machine in the same room; we report both that failure and the measured fix, together with four negative results, one of which the device itself rejected during verification.</w:t>
+        <w:t>Anomalous sound detection for machine condition monitoring is almost always evaluated as an offline benchmark. This paper reports what changes when the same statistical detector is moved onto a microcontroller and required to calibrate itself, in the field, on one machine, from normal sound only. The device is an ESP32-S3 with a single MEMS microphone: a Welch power spectral density front end, a Ledoit-Wolf Mahalanobis score, and a local centre learned in about 115 s from ten calibration windows. Every operating policy — audio quality gate, machine-presence gate, temporal decision rule and threshold — is derived without reading a single anomalous recording. With ten calibration windows, we report a developmental AUC of 0.856 on the DCASE 2026 fan data and 716 ms of computation per 10 s window. On a physical fan the device learns the normal state of a machine it has never heard, derives its own threshold from a normal-only period, verifies that threshold on a later normal-only period, and reports a sustained acoustic change while rejecting speech and door noise as unreliable rather than interpreting them. An earlier version of the same system produced thresholds differing by a factor of 16 across repeated calibrations of the same machine in the same room; we report both that failure and the measured fix, together with four negative results, one of which the device itself rejected during verification.</w:t>
       </w:r>
     </w:p>
     <w:p>
@@ -136,7 +136,7 @@
         <w:pStyle w:val="a3"/>
       </w:pPr>
       <w:r>
-        <w:t>1) A complete self-calibrating detector: 716 ms of computation per 10 s window, an about 14x real-time margin, 355 kB of firmware and no neural network. 2) A normal-only design protocol under which every operating policy is derived, versioned and frozen before any anomalous recording is read. 3) A fail-closed decision hierarchy in which the device refuses to score untrustworthy input, and a reliability gate that rejects an internally unstable window instead of attributing it to a cause a single microphone cannot identify. 4) A threshold derived on the device from one normal-only period and verified on a later one, which removes the factor-16 calibration instability we previously reported as an open failure mode. 5) Measurements on a physical fan, and four negative results, one of which the verification stage rejected on the device before it could reach monitoring.</w:t>
+        <w:t>1) A complete self-calibrating detector: 716 ms of computation per 10 s window, an about 14× real-time margin, 355 kB of firmware and no neural network. 2) A normal-only design protocol under which every operating policy is derived, versioned and frozen before any anomalous recording is read. 3) A fail-closed decision hierarchy in which the device refuses to score untrustworthy input, and a reliability gate that rejects an internally unstable window instead of attributing it to a cause a single microphone cannot identify. 4) A threshold derived on the device from one normal-only period and verified on a later one, which removes the factor-16 calibration instability we previously reported as an open failure mode. 5) Measurements on a physical fan, and four negative results, one of which the verification stage rejected on the device before it could reach monitoring.</w:t>
       </w:r>
     </w:p>
     <w:p>
@@ -168,7 +168,7 @@
         <w:pStyle w:val="a3"/>
       </w:pPr>
       <w:r>
-        <w:t>The firmware image is 354 784 B with research telemetry included and leaves most of the application partition free. The front end is computed in streaming fashion, hop by hop, avoiding the approximately 640 kB full-window float buffer that a 10 s recording would require, and its result is identical to the batch computation. One 10 s window takes 716 ms end to end, feature and score together, which is an about 14x real-time margin.</w:t>
+        <w:t>The firmware image is 354 784 B with research telemetry included and leaves most of the application partition free. The front end is computed in streaming fashion, hop by hop, avoiding the approximately 640 kB full-window float buffer that a 10 s recording would require, and its result is identical to the batch computation. One 10 s window takes 716 ms end to end, feature and score together, which is an about 14× real-time margin.</w:t>
       </w:r>
     </w:p>
     <w:p>
@@ -326,7 +326,7 @@
         <w:pStyle w:val="a3"/>
       </w:pPr>
       <w:r>
-        <w:t>The quality gate checks the exact sample count, RMS level, peak, clipped fraction (at most 1e-3), zero and stuck-sample fractions, and a per-window dropped-sample delta of exactly zero; it also requires the DC offset, every metric and every feature to be finite. Any violation stops the pipeline instead of producing a score, in WAIT, CAL and DET alike. The presence gate declares the machine present immediately at or above the calibrated mean minus 11 dB, and declares it stopped only after three consecutive windows below that level. This separates “machine stopped” from “machine behaving strangely” - two conditions that a distance-based score cannot tell apart, since both are far from the normal centre. Only then is the Mahalanobis score compared against the threshold, and only then does the temporal rule decide whether the comparison becomes an alarm.</w:t>
+        <w:t>The quality gate checks the exact sample count, RMS level, peak, clipped fraction (at most 1e-3), zero and stuck-sample fractions, and a per-window dropped-sample delta of exactly zero; it also requires the DC offset, every metric and every feature to be finite. Any violation stops the pipeline instead of producing a score, in WAIT, CAL and DET alike. The presence gate declares the machine present immediately at or above the calibrated mean minus 11 dB, and declares it stopped only after three consecutive windows below that level. This separates “machine stopped” from “machine behaving strangely” — two conditions that a distance-based score cannot tell apart, since both are far from the normal centre. Only then is the Mahalanobis score compared against the threshold, and only then does the temporal rule decide whether the comparison becomes an alarm.</w:t>
       </w:r>
     </w:p>
     <w:p>
@@ -1828,6 +1828,7 @@
     </w:tbl>
     <w:p>
       <w:pPr>
+        <w:pStyle w:val="tablefootnote"/>
         <w:spacing w:before="40" w:after="120"/>
         <w:jc w:val="left"/>
       </w:pPr>
@@ -2260,7 +2261,7 @@
               <w:rPr>
                 <w:sz w:val="15"/>
               </w:rPr>
-              <w:t>14 389 - 60 050</w:t>
+              <w:t>14 389 – 60 050</w:t>
             </w:r>
           </w:p>
         </w:tc>
@@ -2711,6 +2712,7 @@
     </w:tbl>
     <w:p>
       <w:pPr>
+        <w:pStyle w:val="tablefootnote"/>
         <w:spacing w:before="40" w:after="120"/>
         <w:jc w:val="left"/>
       </w:pPr>
@@ -2727,7 +2729,7 @@
         <w:pStyle w:val="a3"/>
       </w:pPr>
       <w:r>
-        <w:t>The paper trial is the more informative of the two. The feature saw the change in all three blocks - median scores of 26 399, 60 050 and 14 389 against a normal baseline of 1190 - but an alarm was raised only in the third. In the first two the reliability gate held four and three of five windows, so the run of three consecutive reliable windows never completed. A strip of paper held by hand is not a constant stimulus, and the device refuses to call an unstable window an anomaly. Speech and the door produced high scores, 36 838 and 4366, and no alarm, for the same reason.</w:t>
+        <w:t>The paper trial is the more informative of the two. The feature saw the change in all three blocks — median scores of 26 399, 60 050 and 14 389 against a normal baseline of 1190 — but an alarm was raised only in the third. In the first two the reliability gate held four and three of five windows, so the run of three consecutive reliable windows never completed. A strip of paper held by hand is not a constant stimulus, and the device refuses to call an unstable window an anomaly. Speech and the door produced high scores, 36 838 and 4366, and no alarm, for the same reason.</w:t>
       </w:r>
     </w:p>
     <w:p>
@@ -2735,7 +2737,7 @@
         <w:pStyle w:val="a3"/>
       </w:pPr>
       <w:r>
-        <w:t>The tone trial supplies the constant stimulus the paper trial lacked. The alarm was raised after three consecutive reliable windows, about 30 s, and the sustained-deviation event followed twelve alarm windows later. The first nine tone windows scored within the normal range because the loudspeaker was too quiet: the change has to be loud enough relative to the fan's own noise. After the tone was switched off the score fell below the entry threshold but stayed above the release threshold until the trial ended, so that release latency was not measured.</w:t>
+        <w:t>The tone trial supplies the constant stimulus the paper trial lacked. The alarm was raised after three consecutive reliable windows, about 30 s, and the sustained-deviation event followed twelve alarm windows later. The first nine tone windows scored within the normal range because the loudspeaker was too quiet: the change has to be loud enough relative to the fan's own noise. After the tone was switched off the score fell below the entry threshold but stayed above the release threshold until the trial ended, so that release latency was not measured. Fig. 2 shows the score over the whole trial.</w:t>
       </w:r>
     </w:p>
     <w:p>
@@ -2829,7 +2831,7 @@
         <w:pStyle w:val="a3"/>
       </w:pPr>
       <w:r>
-        <w:t>The fourth negative result belongs here, because the verification stage produced it. A more robust estimator was tried on the device, the smaller of the empirical 99th percentile and a Hampel bound of median + 3 x 1.4826 x MAD. It returned a threshold of 791 while the normal verification windows of the same session scored between 2083 and 7766, and verification rejected the calibration before a single monitoring window existed. The median absolute deviation describes only the body of the distribution, and the tail of normal operation on this fan is far longer than three robust deviations. The robust estimator was removed from the live path; a gate that fires rarely still earns its place.</w:t>
+        <w:t>The fourth negative result belongs here, because the verification stage produced it. A more robust estimator was tried on the device, the smaller of the empirical 99th percentile and a Hampel bound of median + 3 × 1.4826 × MAD. It returned a threshold of 791 while the normal verification windows of the same session scored between 2083 and 7766, and verification rejected the calibration before a single monitoring window existed. The median absolute deviation describes only the body of the distribution, and the tail of normal operation on this fan is far longer than three robust deviations. The robust estimator was removed from the live path; a gate that fires rarely still earns its place.</w:t>
       </w:r>
     </w:p>
     <w:p>

</xml_diff>

<commit_message>
Sredi dokumentaciju i radove i sacuvaj rezultate revizije i FW proba
</commit_message>
<xml_diff>
--- a/radovi/telfor2026/telfor2026_asd_esp32s3.docx
+++ b/radovi/telfor2026/telfor2026_asd_esp32s3.docx
@@ -81,7 +81,7 @@
         <w:t>Abstract—</w:t>
       </w:r>
       <w:r>
-        <w:t>Anomalous sound detection for machine condition monitoring is almost always evaluated as an offline benchmark. This paper reports what changes when the same statistical detector is moved onto a microcontroller and required to calibrate itself, in the field, on one machine, from normal sound only. The device is an ESP32-S3 with a single MEMS microphone: a Welch power spectral density front end, a Ledoit-Wolf Mahalanobis score, and a local centre learned in about 115 s from ten calibration windows. Every operating policy — audio quality gate, machine-presence gate, temporal decision rule and threshold — is derived without reading a single anomalous recording. With ten calibration windows, we report a developmental AUC of 0.856 on the DCASE 2026 fan data and 716 ms of computation per 10 s window. On a physical fan the device learns the normal state of a machine it has never heard, derives its own threshold from a normal-only period, verifies that threshold on a later normal-only period, and reports a sustained acoustic change while rejecting speech and door noise as unreliable rather than interpreting them. An earlier version of the same system produced thresholds differing by a factor of 16 across repeated calibrations of the same machine in the same room; we report both that failure and the measured fix, together with four negative results, one of which the device itself rejected during verification.</w:t>
+        <w:t>This paper evaluates a normal-only anomalous sound detector on an ESP32-S3 with one MEMS microphone. A Welch spectral feature and a Ledoit-Wolf Mahalanobis score use a local centre learned from ten normal windows. The deployed ten-window configuration reaches a developmental AUC of 0.856 on DCASE 2026 fan data. Feature and score computation takes about 716 ms per 10 s window. Field commissioning additionally derives a threshold from 44 normal windows and verifies it on 22 later windows; the complete sequence takes about 13.6 min in two recorded trials. The device detects an added tone and withholds decisions on unstable speech and door windows. The paper-strip trial detects only one of three prescribed change blocks and fails its acceptance criteria. Both trials provide valid telemetry, which is distinct from passing the experiment. Earlier threshold instability and a rejected robust estimator are reported alongside these results. The experiments demonstrate on-device execution, but do not establish fault diagnosis or long-term reliability.</w:t>
       </w:r>
     </w:p>
     <w:p>
@@ -120,7 +120,7 @@
         <w:pStyle w:val="a3"/>
       </w:pPr>
       <w:r>
-        <w:t>That formulation is nearly always evaluated offline. A model is fitted on a workstation, scored against a labelled test set, and reported as an area under the ROC curve. The deployment questions stay outside the loop, and they are not small ones. A device installed next to one machine has to decide by itself whether the machine is running at all; whether the audio it has just captured can be trusted; which score is high enough to be called an anomaly; and how long a deviation has to persist before anyone is told about it. None of those questions can be answered with anomalous recordings, because the installation does not have any.</w:t>
+        <w:t>Offline AUC measures ranking across thresholds. Deployment additionally requires a threshold for one installation, checks on audio validity and a rule for persistent deviations. These decisions must be made without assuming access to future faults. The present work studies their implementation and observed limitations on a microcontroller.</w:t>
       </w:r>
     </w:p>
     <w:p>
@@ -128,7 +128,7 @@
         <w:pStyle w:val="a3"/>
       </w:pPr>
       <w:r>
-        <w:t>This paper reports what happened once those questions had to be answered on the device. The system is a self-contained detector on an ESP32-S3 microcontroller with a single MEMS microphone. An operator presses one button, the device listens to the machine for about 115 s, learns its normal sound, and monitors it from then on. In the reported bench run, a PC only replayed the audio stimulus through a loudspeaker; calibration, inference and decisions remained entirely on the device. The contributions are:</w:t>
+        <w:t>The system performs calibration, scoring and alarm decisions on the ESP32-S3. A PC records telemetry, sends operator commands and, in replay trials, supplies the acoustic stimulus. Ten windows learn the centre; threshold derivation and verification follow before monitoring. The contributions are:</w:t>
       </w:r>
     </w:p>
     <w:p>
@@ -136,7 +136,7 @@
         <w:pStyle w:val="a3"/>
       </w:pPr>
       <w:r>
-        <w:t>1) A complete self-calibrating detector: 716 ms of computation per 10 s window, an about 14× real-time margin, 355 kB of firmware and no neural network. 2) A normal-only design protocol under which every operating policy is derived, versioned and frozen before any anomalous recording is read. 3) A fail-closed decision hierarchy in which the device refuses to score untrustworthy input, and a reliability gate that rejects an internally unstable window instead of attributing it to a cause a single microphone cannot identify. 4) A threshold derived on the device from one normal-only period and verified on a later one, which removes the factor-16 calibration instability we previously reported as an open failure mode. 5) Measurements on a physical fan, and four negative results, one of which the verification stage rejected on the device before it could reach monitoring.</w:t>
+        <w:t>1) An on-device statistical detector with measured computation cost and host-to-C checks. 2) A normal-only fitting procedure with separate threshold derivation and verification. 3) A reliability gate that withholds decisions on internally unstable high-score windows. 4) Physical trials with explicit acceptance failures and retained negative results. These contributions concern a developmental fan detector rather than a general fault-diagnosis system.</w:t>
       </w:r>
     </w:p>
     <w:p>
@@ -160,7 +160,7 @@
         <w:pStyle w:val="a3"/>
       </w:pPr>
       <w:r>
-        <w:t>The platform is an ESP32-S3-WROOM-1 N32R16V (240 MHz dual core, 16 MB PSRAM) running ESP-IDF v5.5.5. Audio arrives from one INMP441 MEMS microphone over I2S at 16 kHz, 16 bit, mono. A push-button starts calibration and two LEDs report the device state, so the complete user interface is one button and two lamps. Fig. 1 shows the whole chain, from the microphone to the alarm.</w:t>
+        <w:t>The platform is an ESP32-S3 development board at 240 MHz with 16 MB PSRAM, running ESP-IDF v5.5.5. An INMP441 microphone supplies I2S audio at 16 kHz, converted to 16-bit mono samples. The intended interface has one push-button and two LEDs. The recorded trials use a UART virtual button through the same operator event path; a complete standalone button-and-LED demonstration remains unverified. Fig. 1 shows the signal path.</w:t>
       </w:r>
     </w:p>
     <w:p>
@@ -168,7 +168,7 @@
         <w:pStyle w:val="a3"/>
       </w:pPr>
       <w:r>
-        <w:t>The firmware image is 354 784 B with research telemetry included and leaves most of the application partition free. The front end is computed in streaming fashion, hop by hop, avoiding the approximately 640 kB full-window float buffer that a 10 s recording would require, and its result is identical to the batch computation. One 10 s window takes 716 ms end to end, feature and score together, which is an about 14× real-time margin.</w:t>
+        <w:t>The firmware image is 354 784 B including research telemetry. Streaming processing avoids a 640 kB full-window float buffer. The measured 716 ms covers feature and score computation per 10 s window, not acquisition, UART output or alarm latency. The approximately 14× compute margin is not a worst-case timing guarantee for the full pipeline.</w:t>
       </w:r>
     </w:p>
     <w:p>
@@ -225,7 +225,7 @@
         <w:pStyle w:val="figurecaption"/>
       </w:pPr>
       <w:r>
-        <w:t>Signal path and decision hierarchy. Bold outlines mark the gates that stop the pipeline instead of producing a score. The threshold and the local centre come from the on-site calibration, never from a host.</w:t>
+        <w:t>Signal path and decision hierarchy. Reliability gating applies to high scores. Calibration and threshold fitting run on the device; the PC records telemetry and operator labels.</w:t>
       </w:r>
     </w:p>
     <w:p>
@@ -246,7 +246,7 @@
         <w:pStyle w:val="a3"/>
       </w:pPr>
       <w:r>
-        <w:t>The feature is a Welch power spectral density estimate [4] with an 8192-sample segment and 50 % overlap, reduced to 96 logarithmically spaced bands between 10 Hz and 4 kHz on a logarithmic magnitude scale, with the mean level subtracted. Subtracting the mean turns the feature into a spectral shape rather than a loudness measurement, which matters because microphone distance is not controlled in the field.</w:t>
+        <w:t>The feature uses Welch spectral estimation [4] with 8192-sample periodic Hann segments and 50 % overlap: 38 complete segments per 10 s window. Band mean power is mapped through log10 and centred across 96 logarithmic bands from 10 Hz to 4 kHz. Eight low-frequency bands contain no FFT bin and receive a fixed log floor before centring, so the implementation is not exactly invariant to input gain.</w:t>
       </w:r>
     </w:p>
     <w:p>
@@ -254,7 +254,7 @@
         <w:pStyle w:val="a3"/>
       </w:pPr>
       <w:r>
-        <w:t>The statistical model is deliberately split in two. A per-dimension standardisation and a Ledoit-Wolf shrinkage precision matrix [5] are estimated once, on the host, from 990 normal source-domain clips; the 96x96 matrix occupies 36 864 B in flash. Only the local centre, the arithmetic mean of ten calibration windows, is learned on the deployed machine. Writing z for the standardised feature, c for that local centre and P for the precision matrix, the firmware computes the squared Mahalanobis score s(x) = (z − c)ᵀ P (z − c).</w:t>
+        <w:t>Standardisation and a Ledoit-Wolf precision matrix [5] are fitted offline on 990 source-domain normal clips. The 96×96 float matrix occupies 36 864 B. On-device calibration collects ten normal windows; up to two may be rejected by the calibration consistency check before the centre is frozen. For standardised features z, centre c and precision P, the score is the squared Mahalanobis distance s(x) = (z − c)ᵀ P (z − c).</w:t>
       </w:r>
     </w:p>
     <w:p>
@@ -262,7 +262,7 @@
         <w:pStyle w:val="a3"/>
       </w:pPr>
       <w:r>
-        <w:t>This split is what makes field calibration feasible. The precision matrix is the part that needs a large amount of data; the centre is the part that has to be local. About 115 s of listening is enough for a centre and nowhere near enough for a covariance in 96 dimensions. This ten-window configuration is the deployed and demonstrated setting and reaches an AUC of 0.8556 ± 0.0240 over 20 development splits. A separate 100-split canonical reference with 20 calibration windows reaches an AUC of 0.8666 and is not the deployed configuration.</w:t>
+        <w:t>The source covariance supplies a prior over normal variation, while the centre adapts to the installation. Ten-window centre learning reaches AUC 0.8556 ± 0.0240 over 20 development splits. A separate canonical reference uses 20 calibration windows and 100 splits, reaching 0.8666; it is not the deployed configuration. Neither comparison is an independent final test.</w:t>
       </w:r>
     </w:p>
     <w:p>
@@ -278,7 +278,7 @@
         <w:pStyle w:val="a3"/>
       </w:pPr>
       <w:r>
-        <w:t>A button press starts a fixed sequence: SETTLE, then ten 10 s windows that fix the local centre, then 44 normal-only windows from which the threshold is derived, then 22 later normal-only windows on which that threshold is verified, and only then MONITORING. The entry threshold is the empirical 99th percentile of the derivation window scores and the release threshold the 95th, clamped below by the median and above by half the entry threshold. Derivation and verification are separated in time and in data: if any alarm occurs during verification the calibration is rejected and the device does not arm. The threshold is never adjusted to make verification pass, which would defeat its purpose. In monitoring an alarm needs three consecutive reliable windows above the entry threshold, roughly 30 s, and twelve further alarm windows raise a separate sustained-deviation event.</w:t>
+        <w:t>The guided profile runs SETTLE, ten centre-learning windows, 44 threshold-derivation windows and 22 verification windows before MONITORING. The normal audio alone totals at least 760 s before settling and overhead. Entry is the empirical higher 99th percentile, equal to the maximum for 44 values. Release is the smaller of p95 and half the entry threshold, floored at the median; conflicting bounds reject calibration. VERIFY rejects an alarm, which requires three consecutive high scores, not a single exceedance. Monitoring also requires three consecutive reliable high windows. Sustained deviation is emitted at the twelfth measured alarm window, including entry; HOLD pauses that count.</w:t>
       </w:r>
     </w:p>
     <w:p>
@@ -294,7 +294,7 @@
         <w:pStyle w:val="a3"/>
       </w:pPr>
       <w:r>
-        <w:t>The rule we imposed on ourselves is that any policy shipped to the device must be derivable from normal data alone, because a deployed device has nothing else. This is stronger than avoiding test-set leakage: it forbids using anomalies even to choose a constant.</w:t>
+        <w:t>Model parameters, calibration centres and thresholds are fitted using normal recordings only. This data boundary does not imply that the complete research process was blind to anomalies: results of earlier labelled and physical trials informed subsequent design choices. The policies remain developmental.</w:t>
       </w:r>
     </w:p>
     <w:p>
@@ -302,7 +302,7 @@
         <w:pStyle w:val="a3"/>
       </w:pPr>
       <w:r>
-        <w:t>The rule is enforced mechanically. The quality, presence and temporal policies each live in a versioned JSON file recording the derivation data, the decision statistic, the measured properties, the stated limitation, and a change rule requiring fresh normal-only evidence before any anomaly data are touched. In the evaluator, anomalous clips are loaded only in the final scoring stage, after the method list, the splits, the preprocessing, the global model and the calibration protocol are frozen. The evaluator stops if an anomaly reaches a fitting or calibration cohort, if calibration and held-out sets overlap, or if a feature cache was produced by different code.</w:t>
+        <w:t>Versioned JSON policies record fitting data, parameters and limitations. The evaluator freezes its method list, splits and fitted models before loading anomaly features for scoring. It rejects anomalous fitting inputs, overlapping calibration and evaluation cohorts, and incompatible caches. These checks guard the current computation; they cannot remove bias from earlier model selection.</w:t>
       </w:r>
     </w:p>
     <w:p>
@@ -318,7 +318,7 @@
         <w:pStyle w:val="a3"/>
       </w:pPr>
       <w:r>
-        <w:t>A benchmark script always receives a well-formed clip. A device does not, so scoring is the third of four ordered stages and never the first.</w:t>
+        <w:t>The runtime separates audio validity, machine presence, reliability and temporal alarm decisions. Diagnostic scores may still be computed for held windows; withholding an alarm decision is not the same as omitting all computation.</w:t>
       </w:r>
     </w:p>
     <w:p>
@@ -334,7 +334,7 @@
         <w:pStyle w:val="a3"/>
       </w:pPr>
       <w:r>
-        <w:t>The calibration itself is fail-closed as well. A rejected window does not get replaced silently; calibration stops and the operator repeats it. We prefer a device that refuses to arm over a device that arms on ten windows of which two were noise.</w:t>
+        <w:t>Invalid audio stops calibration. A separate consistency check may discard at most two of the ten otherwise valid calibration windows, recomputing the centre and leave-one-out scores each time. This exception is logged and must be distinguished from silent replacement of bad audio.</w:t>
       </w:r>
     </w:p>
     <w:p>
@@ -342,7 +342,7 @@
         <w:pStyle w:val="a3"/>
       </w:pPr>
       <w:r>
-        <w:t>A fourth stage was added after the first physical trial. Each 10 s window is split into five sub-windows and a feature is computed for each. If those five disagree by more than a per-session limit, the window is internally unstable, its score is not a reliable measure of machine state, and it is excluded from alarm build-up. The limit is derived per session as 1.25 times the largest instability seen among the ten calibration windows; an earlier absolute limit carried the scale of one microphone position and stopped being valid as soon as the setup moved.</w:t>
+        <w:t>Each 10 s window also yields five sub-window features. For a score above the entry threshold, excessive disagreement triggers OBSERVATION_HOLD. Its limit is 1.25 times the largest instability among the ten normal calibration windows. The gate is conditional on a high score; it does not reject every internally unstable low-score window.</w:t>
       </w:r>
     </w:p>
     <w:p>
@@ -1153,7 +1153,7 @@
         <w:pStyle w:val="a3"/>
       </w:pPr>
       <w:r>
-        <w:t>Three outcomes removed design options. Rotation-order features collapse to 0.639: the median fundamental is 34 Hz at all three labelled speeds and their dominant peaks coincide to within one 1.95 Hz bin, so the labelled speeds carry nothing the shape feature does not already have. All three dual-microphone variants are worse than the single channel and the spatial-mask variant reaches 0.450, below chance, so the shipped device uses one microphone by measurement rather than by cost. Adding a transient channel yields +0.0012 AUC against a split-to-split standard deviation of 0.024, which is nothing.</w:t>
+        <w:t>Rotation-order features reach AUC 0.639. The estimated fundamental remains near 34 Hz across the three labelled speeds, which does not establish actual shaft speed without a reference tachometer. All three tested dual-channel variants underperform the first channel. Adding transient features gives +0.0012 AUC; comparing that difference with an individual standard deviation is not a paired significance test, so no meaningful advantage is established.</w:t>
       </w:r>
     </w:p>
     <w:p>
@@ -1845,7 +1845,7 @@
         <w:pStyle w:val="a3"/>
       </w:pPr>
       <w:r>
-        <w:t>The selected rule, hysteresis with entry at the threshold, release at 0.7 times the threshold and three consecutive windows, gives no false alarms, no response at all to a single disturbed window, and roughly half the response to a foreign machine that the plain three-window rule gives, at the same detection latency. No candidate satisfied the strict criterion of zero false alarms and zero response to short disturbances and no missed sustained shift; we report that as a rejected criterion rather than relaxing it silently. One reason is structural: a disturbed window next to one already above the threshold can complete a run of three, and no consecutive-window rule can exclude that. The other reason is the threshold itself, the subject of Section VI.</w:t>
+        <w:t>In this earlier offline comparison, hysteresis with release at 0.7 times entry reduced foreign-machine alarm episodes while retaining three-window latency. No candidate passed every specified criterion. Table II uses synthetic score perturbations and does not measure speech rejection or physical detection accuracy. The final firmware retains consecutive-window hysteresis but uses separately derived absolute entry and release thresholds.</w:t>
       </w:r>
     </w:p>
     <w:p>
@@ -1877,7 +1877,7 @@
         <w:pStyle w:val="a3"/>
       </w:pPr>
       <w:r>
-        <w:t>Two valid trials were then run on a physical fan, both from the same firmware image, with the microphone 40 cm from the shaft. In the first, the induced change was a strip of paper held against the intake grille, repeated three times, followed by speech and a door. In the second, the change was a constant 1 kHz tone from a loudspeaker at a fixed level and position. Table III reports both. The induced changes are controlled, reversible disturbances; neither is a confirmed fault, and we do not call them one.</w:t>
+        <w:t>Two final trials use the same firmware image and one fan, with the microphone 40 cm from the shaft. One applies a hand-held paper strip three times, then speech and a door disturbance. The other uses a reproduced 1 kHz tone. Table III uses only protocol-valid, confirmed, non-transition DET windows: 43/65 and 99/115 respectively. Held windows remain included. Telemetry validity and experiment acceptance are reported separately. Neither stimulus is a confirmed fault.</w:t>
       </w:r>
     </w:p>
     <w:p>
@@ -2200,7 +2200,7 @@
               <w:rPr>
                 <w:sz w:val="15"/>
               </w:rPr>
-              <w:t>1190</w:t>
+              <w:t>1 146</w:t>
             </w:r>
           </w:p>
         </w:tc>
@@ -2219,7 +2219,7 @@
               <w:rPr>
                 <w:sz w:val="15"/>
               </w:rPr>
-              <w:t>7164</w:t>
+              <w:t>7 085</w:t>
             </w:r>
           </w:p>
         </w:tc>
@@ -2261,7 +2261,7 @@
               <w:rPr>
                 <w:sz w:val="15"/>
               </w:rPr>
-              <w:t>14 389 – 60 050</w:t>
+              <w:t>19 844–62 344</w:t>
             </w:r>
           </w:p>
         </w:tc>
@@ -2280,7 +2280,7 @@
               <w:rPr>
                 <w:sz w:val="15"/>
               </w:rPr>
-              <w:t>22 629</w:t>
+              <w:t>23 574</w:t>
             </w:r>
           </w:p>
         </w:tc>
@@ -2303,7 +2303,7 @@
               <w:rPr>
                 <w:sz w:val="15"/>
               </w:rPr>
-              <w:t>Monitoring windows</w:t>
+              <w:t>DET total / eligible</w:t>
             </w:r>
           </w:p>
         </w:tc>
@@ -2322,7 +2322,7 @@
               <w:rPr>
                 <w:sz w:val="15"/>
               </w:rPr>
-              <w:t>65</w:t>
+              <w:t>65 / 43</w:t>
             </w:r>
           </w:p>
         </w:tc>
@@ -2341,7 +2341,7 @@
               <w:rPr>
                 <w:sz w:val="15"/>
               </w:rPr>
-              <w:t>115</w:t>
+              <w:t>115 / 99</w:t>
             </w:r>
           </w:p>
         </w:tc>
@@ -2425,7 +2425,7 @@
               <w:rPr>
                 <w:sz w:val="15"/>
               </w:rPr>
-              <w:t>Alarm latency</w:t>
+              <w:t>Entry rule</w:t>
             </w:r>
           </w:p>
         </w:tc>
@@ -2444,7 +2444,7 @@
               <w:rPr>
                 <w:sz w:val="15"/>
               </w:rPr>
-              <w:t>3 windows</w:t>
+              <w:t>3 reliable high windows</w:t>
             </w:r>
           </w:p>
         </w:tc>
@@ -2463,7 +2463,7 @@
               <w:rPr>
                 <w:sz w:val="15"/>
               </w:rPr>
-              <w:t>3 windows</w:t>
+              <w:t>3 reliable high windows</w:t>
             </w:r>
           </w:p>
         </w:tc>
@@ -2646,7 +2646,7 @@
               <w:rPr>
                 <w:sz w:val="15"/>
               </w:rPr>
-              <w:t>yes, after 12 windows</w:t>
+              <w:t>yes, at 12th alarm window</w:t>
             </w:r>
           </w:p>
         </w:tc>
@@ -2721,7 +2721,7 @@
           <w:i/>
           <w:sz w:val="14"/>
         </w:rPr>
-        <w:t>Both trials come from the same firmware image. The induced changes are controlled disturbances, not confirmed faults.</w:t>
+        <w:t>Counts use eligible windows, including HOLD. Paper trial: GUIDED25 FAIL (1/3 blocks; carried alarm). Tone onset latency and final release latency are unmeasured.</w:t>
       </w:r>
     </w:p>
     <w:p>
@@ -2729,7 +2729,7 @@
         <w:pStyle w:val="a3"/>
       </w:pPr>
       <w:r>
-        <w:t>The paper trial is the more informative of the two. The feature saw the change in all three blocks — median scores of 26 399, 60 050 and 14 389 against a normal baseline of 1190 — but an alarm was raised only in the third. In the first two the reliability gate held four and three of five windows, so the run of three consecutive reliable windows never completed. A strip of paper held by hand is not a constant stimulus, and the device refuses to call an unstable window an anomaly. Speech and the door produced high scores, 36 838 and 4366, and no alarm, for the same reason.</w:t>
+        <w:t>Paper-block median scores are 30 255, 62 344 and 19 844 versus baseline 1146, but an alarm appears only in block three. In each of the first two blocks, three of four eligible windows are held. The GUIDED25 verdict is FAIL: one of three blocks detected, with a carried alarm in recovery. Speech and door medians are 38 307 and 49 549, with no alarms in four and two eligible windows. These short observations do not establish general noise rejection.</w:t>
       </w:r>
     </w:p>
     <w:p>
@@ -2737,7 +2737,7 @@
         <w:pStyle w:val="a3"/>
       </w:pPr>
       <w:r>
-        <w:t>The tone trial supplies the constant stimulus the paper trial lacked. The alarm was raised after three consecutive reliable windows, about 30 s, and the sustained-deviation event followed twelve alarm windows later. The first nine tone windows scored within the normal range because the loudspeaker was too quiet: the change has to be loud enough relative to the fan's own noise. After the tone was switched off the score fell below the entry threshold but stayed above the release threshold until the trial ended, so that release latency was not measured. Fig. 2 shows the score over the whole trial.</w:t>
+        <w:t>The tone trial produces two alarm episodes and a sustained-deviation event. Alarm entry follows three reliable high windows; this is not a measured 30 s delay from initial tone onset. Early tone-labelled windows remain below threshold. Notes describe a later volume increase, but its exact time is not recorded. Recovery-labelled scores remain high for much of the trial and only later fall below entry, without reaching release. Release latency is therefore unmeasured. Fig. 2 retains all DET windows for continuity.</w:t>
       </w:r>
     </w:p>
     <w:p>
@@ -2799,7 +2799,7 @@
         <w:pStyle w:val="1"/>
       </w:pPr>
       <w:r>
-        <w:t>Threshold Instability and Its Fix</w:t>
+        <w:t>Threshold Instability and Revised Commissioning</w:t>
       </w:r>
     </w:p>
     <w:p>
@@ -2807,7 +2807,7 @@
         <w:pStyle w:val="a3"/>
       </w:pPr>
       <w:r>
-        <w:t>The failure mode we previously reported as open is worth restating because the fix follows from it. The same board, microphone, audio source and room produced three calibrations with thresholds of 5687, 347 and 1088. Scoring the windows of run 1 with the threshold of run 2 puts 92 % of them above it; the reverse leaves 8 % above. Across the three runs the threshold spans a factor of 16 while the median score spans a factor of 4.7. The scores were comparatively stable; the threshold was not.</w:t>
+        <w:t>Earlier repeated calibration trials expose threshold sensitivity, with the same board, microphone, audio source and room produced three calibrations with thresholds of 5687, 347 and 1088. Scoring the windows of run 1 with the threshold of run 2 puts 92 % of them above it; the reverse leaves 8 % above. Across the three runs the threshold spans a factor of 16 while the median score spans a factor of 4.7. The scores were comparatively stable; the threshold was not.</w:t>
       </w:r>
     </w:p>
     <w:p>
@@ -2815,7 +2815,7 @@
         <w:pStyle w:val="a3"/>
       </w:pPr>
       <w:r>
-        <w:t>The mechanism was the estimator, not the machine. The threshold was taken from the ten leave-one-out calibration scores as max(Q_0.90, mean + 3 sd). In one run a single window stood out and the standard deviation carried the threshold to 5687; in another the calibration was clean with a standard deviation of 60 while the normal operation that followed had a standard deviation of 8557. Ten windows recorded back to back do not represent how much normal operation varies later.</w:t>
+        <w:t>The earlier estimator used max(Q_0.90, mean + 3 sd) of ten leave-one-out scores. One outlying window inflated the threshold; a cleaner calibration underestimated later normal variation. These observations implicate short calibration and changing acoustics, but do not isolate a single physical cause.</w:t>
       </w:r>
     </w:p>
     <w:p>
@@ -2823,7 +2823,7 @@
         <w:pStyle w:val="a3"/>
       </w:pPr>
       <w:r>
-        <w:t>The fix is the derive-and-verify sequence of Section II.C: the threshold comes from 44 normal-only windows as an empirical percentile rather than from a mean and a standard deviation over ten, and it is then verified on 22 later normal-only windows. In both physical trials the derived threshold passed verification and the resulting monitoring produced two alarm episodes in the paper trial and two in the tone trial, each attributable to an induced change rather than to normal operation.</w:t>
+        <w:t>The revised sequence uses 44 normal derivation windows and 22 later verification windows. Both final trials pass commissioning, with different thresholds for their respective sessions. Two accepted sessions cannot establish calibration repeatability or a low long-term false-alarm rate. The paper trial still fails its prescribed detection and recovery criteria.</w:t>
       </w:r>
     </w:p>
     <w:p>
@@ -2831,7 +2831,7 @@
         <w:pStyle w:val="a3"/>
       </w:pPr>
       <w:r>
-        <w:t>The fourth negative result belongs here, because the verification stage produced it. A more robust estimator was tried on the device, the smaller of the empirical 99th percentile and a Hampel bound of median + 3 × 1.4826 × MAD. It returned a threshold of 791 while the normal verification windows of the same session scored between 2083 and 7766, and verification rejected the calibration before a single monitoring window existed. The median absolute deviation describes only the body of the distribution, and the tail of normal operation on this fan is far longer than three robust deviations. The robust estimator was removed from the live path; a gate that fires rarely still earns its place.</w:t>
+        <w:t>A robust candidate used the smaller of empirical p99 and median + 3 × 1.4826 × MAD, together with a trimmed centre. Its threshold was 791; later normal verification scores reached 2083–7766 and commissioning was rejected. This is evidence that the candidate underestimated variation in that session. Changing both centre and threshold also prevents attributing the failure to either component alone. The candidate remains outside the live firmware path.</w:t>
       </w:r>
     </w:p>
     <w:p>
@@ -2839,7 +2839,7 @@
         <w:pStyle w:val="a3"/>
       </w:pPr>
       <w:r>
-        <w:t>One limitation is unchanged. The calibration quality gate rejects a session whose ten clips disagree, and a single clip deviating by about 0.7 dB in one of 96 bands is enough to trigger it, always in the narrow band around the rotation frequency. The device may discard at most the two worst clips and recompute, which treats the symptom rather than the small variance the borrowed covariance assigns to that band.</w:t>
+        <w:t>The consistency check remains sensitive to narrow-band changes under the source-domain covariance. Trimming up to two calibration windows improves acceptance in one final trial, but does not establish robustness across installations. Eight empty spectral bands and source-to-device covariance mismatch are candidates for future investigation; changing them would require retraining and new validation.</w:t>
       </w:r>
     </w:p>
     <w:p>
@@ -2855,7 +2855,7 @@
         <w:pStyle w:val="a3"/>
       </w:pPr>
       <w:r>
-        <w:t>A statistical anomalous sound detector fits comfortably on an ESP32-S3: 716 ms per 10 s window, 355 kB of firmware, one microphone, one button, and a field calibration that ends with a threshold the device derived and verified by itself. Every operating policy was derived from normal sound alone, and the decision hierarchy fails closed rather than scoring untrustworthy audio.</w:t>
+        <w:t>A statistical detector executes on the ESP32-S3 with 716 ms of measured feature-and-score computation per 10 s window and a 355 kB image. It learns a local centre and derives and verifies alarm thresholds from normal audio. Its recorded decisions can be checked against retained telemetry.</w:t>
       </w:r>
     </w:p>
     <w:p>
@@ -2863,7 +2863,7 @@
         <w:pStyle w:val="a3"/>
       </w:pPr>
       <w:r>
-        <w:t>On a physical fan the device reports a constant acoustic change reliably and rejects speech and a door as unreliable rather than interpreting them. What limits the claim is no longer threshold stability but coverage: one fan, one room, and induced changes that are controlled disturbances rather than confirmed faults. A second machine, a longer normal-only run for a meaningful false-alarm interval, and full-pipeline power remain open.</w:t>
+        <w:t>The tone experiment demonstrates sustained-change signalling. The paper-strip experiment detects one of three blocks and fails its acceptance criteria; speech and door blocks produce no alarms in this short record. Threshold repeatability, recovery after a strong stimulus, independent machines and full-pipeline power remain open. Controlled perturbations are not confirmed mechanical faults.</w:t>
       </w:r>
     </w:p>
     <w:p>
@@ -2875,6 +2875,26 @@
         </w:numPr>
       </w:pPr>
       <w:r>
+        <w:t>Acknowledgment</w:t>
+      </w:r>
+    </w:p>
+    <w:p>
+      <w:pPr>
+        <w:pStyle w:val="a3"/>
+      </w:pPr>
+      <w:r>
+        <w:t>OpenAI Codex assisted with drafting and revising Sections I–VII and checking tables against recorded project data. Experimental values come from the retained measurement artifacts.</w:t>
+      </w:r>
+    </w:p>
+    <w:p>
+      <w:pPr>
+        <w:pStyle w:val="1"/>
+        <w:numPr>
+          <w:ilvl w:val="0"/>
+          <w:numId w:val="0"/>
+        </w:numPr>
+      </w:pPr>
+      <w:r>
         <w:t>References</w:t>
       </w:r>
     </w:p>
@@ -2925,13 +2945,24 @@
       <w:r>
         <w:t>T. Nishida et al., “Description and discussion on DCASE 2026 Challenge Task 2: Noise-aware unsupervised anomalous sound detection for machine condition monitoring,” arXiv:2606.01578, 2026.</w:t>
       </w:r>
+    </w:p>
+    <w:p>
+      <w:pPr>
+        <w:sectPr>
+          <w:type w:val="continuous"/>
+          <w:pgSz w:w="11906" w:h="16838" w:code="9"/>
+          <w:pgMar w:top="1080" w:right="907" w:bottom="1440" w:left="907" w:header="720" w:footer="720" w:gutter="0"/>
+          <w:cols w:num="2" w:space="360"/>
+          <w:titlePg/>
+          <w:docGrid w:linePitch="360"/>
+        </w:sectPr>
+      </w:pPr>
     </w:p>
     <w:sectPr>
       <w:type w:val="continuous"/>
       <w:pgSz w:w="11906" w:h="16838" w:code="9"/>
       <w:pgMar w:top="1080" w:right="907" w:bottom="1440" w:left="907" w:header="720" w:footer="720" w:gutter="0"/>
       <w:cols w:num="2" w:space="360"/>
-      <w:titlePg/>
       <w:docGrid w:linePitch="360"/>
     </w:sectPr>
   </w:body>

</xml_diff>

<commit_message>
Dotjeraj TELFOR rad i provjeri tvrdnje prema mjerenjima
</commit_message>
<xml_diff>
--- a/radovi/telfor2026/telfor2026_asd_esp32s3.docx
+++ b/radovi/telfor2026/telfor2026_asd_esp32s3.docx
@@ -31,7 +31,7 @@
         <w:pStyle w:val="Author"/>
       </w:pPr>
       <w:r>
-        <w:t>Mihajlo Živković and Ivan Mezei</w:t>
+        <w:t>Mihajlo Živković, Ivan Mezei</w:t>
       </w:r>
     </w:p>
     <w:p>
@@ -81,7 +81,7 @@
         <w:t>Abstract—</w:t>
       </w:r>
       <w:r>
-        <w:t>This paper presents an anomalous sound detector for fans that runs on an ESP32-S3 microcontroller with one MEMS microphone. A 96-band log spectrum from an 8192-point Welch estimate is scored by a squared Mahalanobis distance, using a Ledoit-Wolf precision matrix learned offline from normal DCASE 2026 recordings and a center learned on the device. On the fan target domain the detector reaches an AUC of 0.863 with ten calibration windows, against 0.470 for the DCASE autoencoder baseline, and needs 716 ms of computation per 10 s window. After installation the device learns the center, derives entry and release thresholds from 44 normal windows and checks them on 22 further windows before it starts monitoring. A reliability gate holds the decision on windows whose sub-window spectra disagree. On a physical fan, a constant 1 kHz tone raised an alarm and a sustained-deviation event, while a hand-held paper strip was detected in only one of three blocks because the gate held most of its windows. We report this failure together with the threshold instability that led to the commissioning procedure and a level dependence of the band map found after the trials.</w:t>
+        <w:t>This paper presents an anomalous sound detector for fans that runs on an ESP32-S3 microcontroller with one MEMS microphone. A 96-band log spectrum from an 8192-point Welch estimate is scored by a squared Mahalanobis distance, using a Ledoit-Wolf precision matrix learned offline from normal DCASE 2026 recordings and a center learned on the device. On the fan target domain the detector reaches an AUC of 0.863 with ten calibration windows, against 0.470 for the evaluated autoencoder baseline, and needs 716 ms of computation per 10 s window. In the reported trials the device learns the center, derives entry and release thresholds from 44 normal windows and checks them on 22 further windows before it starts monitoring. A reliability gate holds the decision on windows whose sub-window spectra disagree. Physical trials confirmed local commissioning, detection of a sustained 1 kHz tone and alarm retention under hysteresis. A manually held paper strip produced variable spectra; one of three blocks raised an alarm, which was subsequently released. Offline replay reproduced the reliability and alarm decisions in all 180 monitoring windows. These results demonstrate the implemented detector and identify its limits for unsteady changes and shifts in sound level.</w:t>
       </w:r>
     </w:p>
     <w:p>
@@ -112,7 +112,7 @@
         <w:pStyle w:val="a3"/>
       </w:pPr>
       <w:r>
-        <w:t>Rotating machines change their sound well before they fail, and a microphone can listen without touching the machine. The DCASE challenge turned this into an established benchmark: a detector is trained on normal sound only and has to flag anomalies it has never heard, often on a machine instance or operating condition that was absent from training [1]-[5]. Published systems are mostly evaluated offline by the area under the ROC curve (AUC), on hardware far larger than a sensor node.</w:t>
+        <w:t>Changes in the sound of a rotating machine can indicate a developing fault [8], and a microphone can listen without touching the machine. The DCASE challenge turned this into an established benchmark: a detector is trained on normal sound only and has to flag anomalies it has never heard, often on a machine instance or operating condition that was absent from training [1]-[5]. Published systems are mostly evaluated offline by the area under the ROC curve (AUC), on PCs or GPUs rather than on a microcontroller.</w:t>
       </w:r>
     </w:p>
     <w:p>
@@ -128,7 +128,7 @@
         <w:pStyle w:val="a3"/>
       </w:pPr>
       <w:r>
-        <w:t>This paper describes a complete detector for fans on an ESP32-S3 and what happened when it was tested on a physical fan. The contributions are: 1) a statistical detector built on a high-resolution power spectrum that outperforms autoencoders on the DCASE fan task in less than half of their on-device time; 2) commissioning on the device that learns the center and both alarm thresholds from normal sound and verifies them before monitoring; 3) a fail-closed decision chain with quality, presence, reliability and temporal gates; 4) physical trials in which one stimulus is detected and another fails its acceptance test, followed by an analysis of the recorded features.</w:t>
+        <w:t>This paper describes a complete detector for fans on an ESP32-S3 and what happened when it was tested on a physical fan. The contributions are: 1) a statistical detector with higher AUC on the DCASE fan development data than the evaluated autoencoder baselines and less than half the measured computation time of the small int8 autoencoder; 2) commissioning on the device that learns the center and both alarm thresholds from normal sound and verifies them before monitoring; 3) a fail-closed decision chain: a window can raise an alarm only after it passes quality, machine-presence, reliability and temporal checks, and a failed check withholds the decision; 4) trials on a physical fan, with an offline replay of the recorded features, which confirm that the device made its decisions as specified and show where detection falls short for unsteady changes.</w:t>
       </w:r>
     </w:p>
     <w:p>
@@ -152,7 +152,7 @@
         <w:pStyle w:val="a3"/>
       </w:pPr>
       <w:r>
-        <w:t>The platform is an ESP32-S3-WROOM-1 module (240 MHz, 16 MB PSRAM) running ESP-IDF v5.5.5. An INMP441 MEMS microphone delivers I2S audio sampled at 16 kHz and converted to 16-bit samples. The user interface is one push-button and two LEDs. In the reported trials the button was emulated over UART through the same event path, and a PC logged telemetry and operator labels. Fig. 1 shows the signal path. The firmware image, including research telemetry, has 354,784 B.</w:t>
+        <w:t>The platform is an ESP32-S3-WROOM-1 module (240 MHz, 16 MB PSRAM) running ESP-IDF v5.5.5. An INMP441 MEMS microphone delivers I2S audio sampled at 16 kHz and converted to 16-bit samples. The user interface is one push-button and two LEDs. In the reported trials the button was emulated over UART through the same event path, and a PC logged telemetry and operator labels. Fig. 1 shows the signal path. The firmware image, including research telemetry, is 354,784 B.</w:t>
       </w:r>
     </w:p>
     <w:p>
@@ -222,7 +222,7 @@
         <w:pStyle w:val="a3"/>
       </w:pPr>
       <w:r>
-        <w:t>Each 10 s window of 159,744 samples is split into 38 Welch segments [6] of 8192 samples with a periodic Hann window and 50 % overlap, which gives a bin spacing of 1.95 Hz. Mean power is taken in 96 logarithmic bands from 10 Hz to 4 kHz and converted by log10, and the mean over bands is subtracted to remove the broadband level. The firmware accumulates segment power as audio arrives, so it never holds the 640 kB float buffer of a whole window. Fine resolution matters for fans, whose sound is dominated by narrow lines at the rotation and blade-pass frequencies and their harmonics [8]. A 1024-point frame has 15.6 Hz spacing, and mel filtering merges these lines further.</w:t>
+        <w:t>Each 10 s window of 159,744 samples is split into 38 Welch segments [6] of 8192 samples with a periodic Hann window and 50 % overlap, which gives a bin spacing of 1.95 Hz. Mean power is taken in 96 logarithmic bands from 10 Hz to 4 kHz and converted by log10, and the mean over bands is subtracted to reduce sensitivity to broadband level. The firmware accumulates segment power as audio arrives, so it never holds the 640 kB float buffer of a whole window. Fine resolution matters for fans, whose sound is dominated by narrow lines at the rotation and blade-pass frequencies and their harmonics [8]. A 1024-point frame has 15.6 Hz spacing, and mel filtering merges these lines further.</w:t>
       </w:r>
     </w:p>
     <w:p>
@@ -811,6 +811,10 @@
     <w:p>
       <w:pPr>
         <w:pStyle w:val="tablefootnote"/>
+        <w:numPr>
+          <w:ilvl w:val="0"/>
+          <w:numId w:val="0"/>
+        </w:numPr>
         <w:spacing w:before="40" w:after="120"/>
         <w:jc w:val="left"/>
       </w:pPr>
@@ -867,7 +871,7 @@
         <w:pStyle w:val="a3"/>
       </w:pPr>
       <w:r>
-        <w:t>The current firmware estimates the center and the thresholds from separate windows (Fig. 2). After at least four settling windows, three of them stable, the device records ten center windows. The coefficient of variation of their leave-one-out scores must not exceed 0.6. Up to two windows with the largest scores may be discarded, recomputing the center after each; otherwise calibration is rejected. The next 44 windows are scored against the frozen center. The entry threshold is their empirical upper 99th percentile, and the release threshold their 95th percentile kept between the median and half the entry threshold. The last 22 windows run the full alarm logic, and a single alarm episode rejects the commissioning. The sequence needs at least 760 s of audio and took 13.6 min in both trials. The center is never updated afterwards, so a slowly developing fault cannot be absorbed as normal.</w:t>
+        <w:t>The firmware estimates the center and the thresholds from separate windows (Fig. 2). The trials used the GUIDED25 setting: 44 threshold windows and 22 verification windows, instead of the default 120 and 60. After at least four settling windows, three of them stable, the device records ten center windows. The coefficient of variation of their leave-one-out scores must not exceed 0.6. Up to two windows with the largest scores may be discarded, recomputing the center after each; otherwise calibration is rejected. The next 44 windows are scored against the frozen center. The entry threshold is their empirical upper 99th percentile, and the release threshold their 95th percentile kept between the median and half the entry threshold. The last 22 windows are checked with the same alarm entry and release rule, without reliability holds. A single alarm episode rejects commissioning. Including settling, this setting needs at least 80 windows, about 800 s of audio, and took 13.6 min in both trials. The center is never updated afterwards, so a slowly developing fault cannot be absorbed as normal.</w:t>
       </w:r>
     </w:p>
     <w:p>
@@ -875,7 +879,7 @@
         <w:pStyle w:val="a3"/>
       </w:pPr>
       <w:r>
-        <w:t>The verification step has already rejected a bad design. A robust candidate, the smaller of the empirical Q0.99 and median + 3·1.4826·MAD with a trimmed center, produced a threshold of 791 in one session. Its verification windows scored between 2083 and 7766, and the device refused to start monitoring.</w:t>
+        <w:t>The verification step rejected a threshold that was too low. A robust candidate, the smaller of the empirical Q0.99 and median + 3·1.4826·MAD with a trimmed center, produced a threshold of 791 in one session. Its 22 verification windows scored from 263 to 7766. Eight exceeded the threshold, including the last six in a row, so the device correctly refused to start monitoring.</w:t>
       </w:r>
     </w:p>
     <w:p>
@@ -891,7 +895,7 @@
         <w:pStyle w:val="a3"/>
       </w:pPr>
       <w:r>
-        <w:t>Every window passes four gates before it can raise an alarm. The quality gate checks the exact sample count, RMS level, peak, clipped fraction (at most 10⁻³), zero and stuck-sample fractions and a per-window count of dropped samples, which must be zero, and requires all metrics and features to be finite. A violation stops the pipeline in every phase instead of producing a score. The presence gate treats the machine as running while the window level stays within 11 dB of the calibrated level, and as stopped only after three consecutive windows below it. A stopped fan and a changed fan are both far from the center, and only the level separates them.</w:t>
+        <w:t>Every window passes four gates before it can raise an alarm. The quality gate checks the exact sample count, RMS level, peak, clipped fraction (at most 10⁻³), zero and stuck-sample fractions and a per-window count of dropped samples, which must be zero, and requires all metrics and features to be finite. A violation stops the pipeline in every phase instead of producing a score. The presence gate treats the machine as running while the window level is no more than 11 dB below the calibrated level, and as stopped after three consecutive windows below this limit. A stopped fan and a changed fan are both far from the center, and only the level separates them.</w:t>
       </w:r>
     </w:p>
     <w:p>
@@ -907,7 +911,7 @@
         <w:pStyle w:val="a3"/>
       </w:pPr>
       <w:r>
-        <w:t>An alarm requires three consecutive reliable windows above the entry threshold and is released at the first window at or below the release threshold. In an offline comparison of five temporal rules on 2000 normal windows over 40 splits, this rule produced no false alarm episodes and 5.4 episodes per hour on recordings of a different fan, against 11.2 for three consecutive windows without hysteresis. At the twelfth alarm window the device emits a sustained-deviation event, and held windows pause this count. Events are reported as an unknown change, never as a diagnosed fault.</w:t>
+        <w:t>An alarm requires three consecutive reliable windows above the entry threshold and is released at the first window at or below the release threshold. In an earlier comparison of 11 temporal-rule configurations on 2000 normal windows over 40 splits, a rule of this form, with release at 0.7 of the entry threshold, produced no false alarm episodes, as did three consecutive windows without hysteresis. On recordings of a different fan, hysteresis reduced episodes from 11.2 to 5.4 per hour. At the twelfth alarm window the device emits a sustained-deviation event, and held windows pause this count. Events are reported as an unknown change, never as a diagnosed fault.</w:t>
       </w:r>
     </w:p>
     <w:p>
@@ -923,7 +927,7 @@
         <w:pStyle w:val="a3"/>
       </w:pPr>
       <w:r>
-        <w:t>Both trials used the same firmware image and one electric fan, with the microphone 40 cm from its shaft in a room. In the first, a paper strip was held in the airflow in three blocks, followed by speech and a door disturbance. In the second, a loudspeaker played a constant 1 kHz tone. The operator labeled conditions from the PC. Metrics use windows with a valid protocol, a confirmed label and no label change inside the window: 43 of 65 and 99 of 115 monitoring windows, held windows included. Table II summarizes both sessions and Fig. 2 shows every window.</w:t>
+        <w:t>Both trials used the same firmware image and one electric fan, with the microphone 40 cm from the fan in a room. In the first, a paper strip was held by hand in the airflow in three blocks, followed by speech and a door disturbance. In the second, a loudspeaker played a 1 kHz tone at varying levels. The operator labeled conditions from the PC. Metrics use windows with a valid protocol, a confirmed label and no label change inside the window: 43 of 65 and 99 of 115 monitoring windows, held windows included. Table II summarizes both sessions and Fig. 2 shows every window.</w:t>
       </w:r>
     </w:p>
     <w:p>
@@ -1391,7 +1395,7 @@
                 <w:b w:val="0"/>
                 <w:sz w:val="15"/>
               </w:rPr>
-              <w:t>1, block 3 only</w:t>
+              <w:t>1, block 3; released</w:t>
             </w:r>
           </w:p>
         </w:tc>
@@ -1411,7 +1415,7 @@
                 <w:b w:val="0"/>
                 <w:sz w:val="15"/>
               </w:rPr>
-              <w:t>1, not released</w:t>
+              <w:t>1, retained by hysteresis</w:t>
             </w:r>
           </w:p>
         </w:tc>
@@ -1566,7 +1570,7 @@
                 <w:b w:val="0"/>
                 <w:sz w:val="15"/>
               </w:rPr>
-              <w:t>Acceptance</w:t>
+              <w:t>Paper protocol criteria</w:t>
             </w:r>
           </w:p>
         </w:tc>
@@ -1586,7 +1590,7 @@
                 <w:b w:val="0"/>
                 <w:sz w:val="15"/>
               </w:rPr>
-              <w:t>FAIL, 1 of 3 blocks</w:t>
+              <w:t>not met: 1/3; carried alarm</w:t>
             </w:r>
           </w:p>
         </w:tc>
@@ -1606,7 +1610,7 @@
                 <w:b w:val="0"/>
                 <w:sz w:val="15"/>
               </w:rPr>
-              <w:t>alarm and event</w:t>
+              <w:t>not applicable</w:t>
             </w:r>
           </w:p>
         </w:tc>
@@ -1622,6 +1626,71 @@
           <w:p>
             <w:pPr>
               <w:pStyle w:val="tablecopy"/>
+              <w:keepNext/>
+              <w:jc w:val="left"/>
+            </w:pPr>
+            <w:r/>
+            <w:r>
+              <w:rPr>
+                <w:b w:val="0"/>
+                <w:sz w:val="15"/>
+              </w:rPr>
+              <w:t>Decision replay</w:t>
+            </w:r>
+          </w:p>
+        </w:tc>
+        <w:tc>
+          <w:tcPr>
+            <w:tcW w:type="dxa" w:w="1644"/>
+          </w:tcPr>
+          <w:p>
+            <w:pPr>
+              <w:pStyle w:val="tablecopy"/>
+              <w:keepNext/>
+              <w:jc w:val="center"/>
+            </w:pPr>
+            <w:r/>
+            <w:r>
+              <w:rPr>
+                <w:b w:val="0"/>
+                <w:sz w:val="15"/>
+              </w:rPr>
+              <w:t>65/65 agree</w:t>
+            </w:r>
+          </w:p>
+        </w:tc>
+        <w:tc>
+          <w:tcPr>
+            <w:tcW w:type="dxa" w:w="1474"/>
+          </w:tcPr>
+          <w:p>
+            <w:pPr>
+              <w:pStyle w:val="tablecopy"/>
+              <w:keepNext/>
+              <w:jc w:val="center"/>
+            </w:pPr>
+            <w:r/>
+            <w:r>
+              <w:rPr>
+                <w:b w:val="0"/>
+                <w:sz w:val="15"/>
+              </w:rPr>
+              <w:t>115/115 agree</w:t>
+            </w:r>
+          </w:p>
+        </w:tc>
+      </w:tr>
+      <w:tr>
+        <w:trPr>
+          <w:cantSplit/>
+        </w:trPr>
+        <w:tc>
+          <w:tcPr>
+            <w:tcW w:type="dxa" w:w="1644"/>
+          </w:tcPr>
+          <w:p>
+            <w:pPr>
+              <w:pStyle w:val="tablecopy"/>
               <w:jc w:val="left"/>
             </w:pPr>
             <w:r/>
@@ -1677,6 +1746,10 @@
     <w:p>
       <w:pPr>
         <w:pStyle w:val="tablefootnote"/>
+        <w:numPr>
+          <w:ilvl w:val="0"/>
+          <w:numId w:val="0"/>
+        </w:numPr>
         <w:spacing w:before="40" w:after="120"/>
         <w:jc w:val="left"/>
       </w:pPr>
@@ -1734,7 +1807,7 @@
         <w:pStyle w:val="figurecaption"/>
       </w:pPr>
       <w:r>
-        <w:t>Complete sessions on the physical fan, one point per 10 s window: (a) paper strip (P), speech (S) and door (D); (b) constant 1 kHz tone. Thresholds are derived from the DERIVE windows. Windows before the first labeled block are unconfirmed and excluded from Table II.</w:t>
+        <w:t>Complete sessions on the physical fan, one point per 10 s window: (a) paper strip (P), speech (S) and door (D); (b) 1 kHz tone. Shading follows operator labels, not independently measured stimulus boundaries; the tone continued beyond its shaded block. Thresholds come from DERIVE. Unconfirmed windows are excluded from Table II.</w:t>
       </w:r>
     </w:p>
     <w:p>
@@ -1755,7 +1828,7 @@
         <w:pStyle w:val="a3"/>
       </w:pPr>
       <w:r>
-        <w:t>The strip raised the median scores of its three blocks to 30,255, 62,344, 19,844, against 1146 for the baseline, all well above the entry threshold of 8084. In the first two blocks, however, three of four windows were held, and three consecutive reliable exceedances never occurred. At the end of block one two reliable high windows came in a row, one short of an alarm. An alarm entered only in block three, lasted two windows into the following recovery block and was then released. The acceptance test therefore failed with one of three blocks detected. Speech and door windows reached medians of 38,307 and 49,549; all four speech windows and one of two door windows were held, and neither raised an alarm.</w:t>
+        <w:t>The strip raised the median scores of its three blocks to 30,255, 62,344, 19,844, against 1146 for the baseline, all well above the entry threshold of 8084. In the first two blocks, however, three of four windows were held, and three consecutive reliable exceedances never occurred. Holding the strip steady by hand was difficult. The recorded spectra varied within and between windows: in block one the scores ranged from 16,008 to 56,167. The five sub-window spectra often differed enough to trigger the reliability gate. An alarm entered only in block three, lasted two windows into the following recovery block and was then released. The predefined paper protocol criteria were not met: only one of three blocks was detected and the alarm extended into recovery. Speech and door windows reached medians of 38,307 and 49,549; all four speech windows and one of two door windows were held, and neither raised an alarm.</w:t>
       </w:r>
     </w:p>
     <w:p>
@@ -1763,7 +1836,7 @@
         <w:pStyle w:val="2"/>
       </w:pPr>
       <w:r>
-        <w:t>Constant tone</w:t>
+        <w:t>Sustained tone</w:t>
       </w:r>
     </w:p>
     <w:p>
@@ -1771,7 +1844,15 @@
         <w:pStyle w:val="a3"/>
       </w:pPr>
       <w:r>
-        <w:t>The first tone windows fluctuated around the entry threshold, and several of them were held. The 1 kHz band was raised from the first tone window. At about 20.5 min the 3 kHz band, at the third harmonic of the tone, rose as well, which matches a level increase noted by the operator without a time stamp. The alarm then entered after three reliable windows, and the sustained-deviation event followed 130 s later. The operator marked the end of the tone at 23.3 min, but the 1 kHz band stayed about 42 standardized units above the center for another 36 windows, so the tone was still playing until about 29.4 min. After that the scores settled between 12,266 and 19,561, above the release threshold of 10,905, and the recording ended 14 windows later without a release. The release latency is therefore not measured. In both sessions feature and score computation took 716 to 728 ms per window, and no window lost samples.</w:t>
+        <w:t>The tone level varied early in the trial: the 1 kHz band rose from the first tone window but briefly returned close to its normal level later. Scores crossed above and below the entry threshold, and several windows were held. At about 20.5 min both the 1 kHz band and its third harmonic at 3 kHz rose strongly. This is consistent with a level increase noted by the operator without a time stamp. The alarm then entered after three reliable windows, and the sustained-deviation event followed 130 s later. The operator marked the end of the tone at 23.3 min, but the 1 kHz band stayed about 42 standardized units above the center for another 36 windows, so the tone was still playing until about 29.4 min. After that the scores settled between 12,266 and 19,561, below the entry threshold but above the release threshold of 10,905. The alarm therefore remained active as specified by hysteresis, which requires the score to reach the lower threshold rather than a fixed waiting time. The recording ended 14 windows later without a release, so its latency was not measured. The trial confirmed tone detection, sustained-deviation reporting and the expected alarm retention.</w:t>
+      </w:r>
+    </w:p>
+    <w:p>
+      <w:pPr>
+        <w:pStyle w:val="a3"/>
+      </w:pPr>
+      <w:r>
+        <w:t>Offline verification recomputed the reliability holds from the five recorded sub-window features and replayed the temporal C code whose hash matches the trial provenance. All holds and alarm decisions agreed with the device: 65/65 paper-strip and 115/115 tone windows, including transitions and unconfirmed labels. This confirms that the recorded decisions follow the implemented rules; it does not mean that every induced change was detected. In both sessions computation took 716 to 728 ms per window, with no reported sample losses.</w:t>
       </w:r>
     </w:p>
     <w:p>
@@ -1865,7 +1946,7 @@
         <w:pStyle w:val="a3"/>
       </w:pPr>
       <w:r>
-        <w:t>We rescored every recorded monitoring window with its band level reset to the calibration value. The recomputation reproduces the device scores within a relative error of 10⁻⁶. The medians of the paper-strip blocks and of the tone change by less than 4 %, so their detection rests on spectral shape. Speech and door medians drop by 26 % and 34 % and remain several times above the entry threshold.</w:t>
+        <w:t>First, rescoring the original recorded features reproduced the device scores within a relative error of 10⁻⁶. We then separately reset each window's band level to the calibration value and rescored it. The medians of the paper-strip blocks and of the tone change by less than 4 %, so their detection rests on spectral shape. Speech and door medians drop by 26 % and 34 % and remain several times above the entry threshold.</w:t>
       </w:r>
     </w:p>
     <w:p>
@@ -1889,7 +1970,7 @@
         <w:pStyle w:val="a3"/>
       </w:pPr>
       <w:r>
-        <w:t>The two outcomes share one mechanism. The paper strip was held by hand and moved within each window, so its sub-windows disagreed and the reliability gate treated it like speech. The tone was steady and passed. With one microphone the gate cannot separate an unsteady change on the machine from an unsteady sound around it, and the paper trial shows the price of that choice.</w:t>
+        <w:t>The detector targets sustained, reliable spectral deviations; it does not require a single constant frequency. The hand-held paper strip produced variable sub-window spectra, whereas the tone eventually provided three reliable exceedances and a sustained alarm. The gate responded consistently to this difference. However, it cannot identify whether instability comes from the machine or its surroundings. The paper trial therefore demonstrates both the intended rejection of unstable observations and the limited detection of unsteady changes.</w:t>
       </w:r>
     </w:p>
     <w:p>
@@ -1897,7 +1978,7 @@
         <w:pStyle w:val="a3"/>
       </w:pPr>
       <w:r>
-        <w:t>The thresholds are the second open point. With 44 windows the upper 99th percentile equals the maximum, so one high normal window sets the entry threshold. In the tone session a short rise near the end of DERIVE put it at 21,810, three times the monitoring baseline of 7085, and the early tone windows scored close to this level. The rule is conservative on purpose. Two accepted sessions are too few to tell how repeatable the thresholds are across installations.</w:t>
+        <w:t>A second limitation is the threshold rule. With the 44 windows used in these trials, the upper 99th percentile equals the maximum, so one high normal window sets the entry threshold. In the tone session a short rise near the end of DERIVE put it at 21,810, three times the monitoring baseline of 7085, and the early tone windows scored close to this level. The rule is conservative on purpose. Two accepted sessions are too few to tell how repeatable the thresholds are across installations.</w:t>
       </w:r>
     </w:p>
     <w:p>
@@ -1913,7 +1994,7 @@
         <w:pStyle w:val="a3"/>
       </w:pPr>
       <w:r>
-        <w:t>A statistical detector with a 37.6 kB model runs on the ESP32-S3 in 716 ms per 10 s window and outperforms autoencoders on the DCASE fan task. The device learns its center and thresholds from normal sound and refuses to monitor when verification fails. On a physical fan it detected a constant tone and reported it as sustained, and it missed two of three paper-strip blocks because the reliability gate held them.</w:t>
+        <w:t>A statistical detector with a 37.6 kB model runs on the ESP32-S3 in 716 ms per 10 s window and achieves higher AUC on the DCASE fan development data than the evaluated autoencoder baselines. Physical trials demonstrated commissioning from normal sound, tone detection, sustained-deviation reporting and alarm retention consistent with hysteresis. The paper trial demonstrated alarm activation and release in one of three blocks. Replay reproduced all 180 monitoring decisions, confirming that the firmware behaved as specified in the tested installation.</w:t>
       </w:r>
     </w:p>
     <w:p>
@@ -1921,7 +2002,7 @@
         <w:pStyle w:val="a3"/>
       </w:pPr>
       <w:r>
-        <w:t>The evidence comes from one fan, one room and two sessions, and both stimuli were induced changes; no mechanical fault was tested. Release after a strong stimulus, power consumption and standalone operation with the button and LEDs remain to be measured. The next steps are a physical test of the level-invariant band map and a reliability gate that looks at more than one window before it holds a decision.</w:t>
+        <w:t>The evidence comes from one fan, one room and two sessions, and both stimuli were induced changes; no mechanical fault was tested. The paper protocol did not meet its predefined detection and recovery criteria. Final release after the tone, power consumption and standalone operation with the button and LEDs remain unmeasured. Further work should repeat the paper trial with a fixed holder, test the level-invariant band map on hardware and assess detection of unsteady changes in independent installations.</w:t>
       </w:r>
     </w:p>
     <w:p>
@@ -2086,7 +2167,6 @@
       <w:rPr>
         <w:sz w:val="16"/>
       </w:rPr>
-      <w:t>[TODO] IEEE copyright notice - the exact number is issued by the TELFOR registration system (registration.telfor.rs) and must be inserted here before submission.</w:t>
     </w:r>
   </w:p>
 </w:ftr>

</xml_diff>

<commit_message>
Zavrsi provjeru TELFOR tvrdnji prije mentorskog pregleda
</commit_message>
<xml_diff>
--- a/radovi/telfor2026/telfor2026_asd_esp32s3.docx
+++ b/radovi/telfor2026/telfor2026_asd_esp32s3.docx
@@ -81,7 +81,7 @@
         <w:t>Abstract—</w:t>
       </w:r>
       <w:r>
-        <w:t>This paper presents an anomalous sound detector for fans that runs on an ESP32-S3 microcontroller with one MEMS microphone. A 96-band log spectrum from an 8192-point Welch estimate is scored by a squared Mahalanobis distance, using a Ledoit-Wolf precision matrix learned offline from normal DCASE 2026 recordings and a center learned on the device. On the fan target domain the detector reaches an AUC of 0.863 with ten calibration windows, against 0.470 for the evaluated autoencoder baseline, and needs 716 ms of computation per 10 s window. In the reported trials the device learns the center, derives entry and release thresholds from 44 normal windows and checks them on 22 further windows before it starts monitoring. A reliability gate holds the decision on windows whose sub-window spectra disagree. Physical trials confirmed local commissioning, detection of a sustained 1 kHz tone and alarm retention under hysteresis. A manually held paper strip produced variable spectra; one of three blocks raised an alarm, which was subsequently released. Offline replay reproduced the reliability and alarm decisions in all 180 monitoring windows. These results demonstrate the implemented detector and identify its limits for unsteady changes and shifts in sound level.</w:t>
+        <w:t>This paper presents an anomalous sound detector for fans that runs on an ESP32-S3 microcontroller with one MEMS microphone. A 96-band log spectrum from an 8192-point Welch estimate is scored by a squared Mahalanobis distance, using a Ledoit-Wolf precision matrix learned offline from normal DCASE 2026 recordings and a center learned on the device. In offline evaluation on the fan target domain, the design reaches an AUC of 0.863 with ten calibration windows, against 0.470 for the evaluated autoencoder baseline, and needs 716 ms of computation per 10 s window. In the reported trials the device learns the center, derives entry and release thresholds from 44 normal windows and checks them on 22 further windows before it starts monitoring. A reliability gate holds the decision on high-scoring windows whose sub-window spectra disagree. Physical trials confirmed local commissioning, detection of a sustained 1 kHz tone and alarm retention under hysteresis. A manually held paper strip produced variable spectra; one of three blocks raised an alarm, which was subsequently released. Offline replay reproduced the reliability and alarm decisions in all 180 monitoring windows. These results demonstrate the implemented detector and identify its limits for unsteady changes and shifts in sound level.</w:t>
       </w:r>
     </w:p>
     <w:p>
@@ -120,7 +120,7 @@
         <w:pStyle w:val="a3"/>
       </w:pPr>
       <w:r>
-        <w:t>A detector mounted next to a machine has a different job. It has to set a threshold for one particular installation, reject audio it cannot trust, and decide when a deviation has lasted long enough to report. None of these steps may rely on fault examples, because a new installation has none. TinyML benchmarks show that anomaly detection models fit on microcontrollers [9], but they report the accuracy and latency of the model alone.</w:t>
+        <w:t>A detector mounted next to a machine has a different job. It has to set a threshold for one particular installation, reject audio it cannot trust, and decide when a deviation has lasted long enough to report. None of these steps may rely on fault examples, because a new installation has none. MLPerf Tiny includes anomaly detection on microcontrollers and measures inference accuracy, latency and energy [9]. Here the focus also includes commissioning and alarm decisions for one installation.</w:t>
       </w:r>
     </w:p>
     <w:p>
@@ -201,7 +201,7 @@
         <w:pStyle w:val="figurecaption"/>
       </w:pPr>
       <w:r>
-        <w:t>Signal path and decision chain. Shaded blocks are fail-closed gates. Calibration, thresholds and alarms are computed on the device; the PC only logs telemetry and operator labels.</w:t>
+        <w:t>Signal path and decision chain. Shaded blocks are fail-closed gates. Calibration, thresholds and alarms are computed on the device; the PC logs telemetry and sends operator commands.</w:t>
       </w:r>
     </w:p>
     <w:p>
@@ -246,7 +246,7 @@
         <w:pStyle w:val="a3"/>
       </w:pPr>
       <w:r>
-        <w:t>The same C source computes features on the PC and on the device. The host-to-C difference is at most 9.5·10⁻⁷ on a benchmark file, and the host-to-device difference on a live microphone capture is at most 1.7·10⁻⁶. Offline results therefore describe the same computation that runs on the device.</w:t>
+        <w:t>The same C source computes features on the PC and on the device. The maximum absolute feature difference between the Python reference and C is about 9.54·10⁻⁷ on a benchmark file, and the host-to-device difference on a live microphone capture is about 1.70·10⁻⁶. These checks confirm agreement of the feature computation on the tested audio.</w:t>
       </w:r>
     </w:p>
     <w:p>
@@ -262,7 +262,7 @@
         <w:pStyle w:val="a3"/>
       </w:pPr>
       <w:r>
-        <w:t>Table I compares the deployed detector with the DCASE autoencoder baseline [2] and with log-mel statistics scored by the same Mahalanobis backend. Rows with a local center use the same 100 random calibration splits, and calibration windows are never scored. The autoencoders follow the DCASE recipe without a local center, so their rows serve only as a reference point. With the same backend, the PSD front end gains 0.24 AUC over log-mel statistics. On the device it needs 0.72 s per window, while an int8 autoencoder with 45k parameters on TensorFlow Lite Micro needs 1.54 s including its log-mel front end.</w:t>
+        <w:t>Table I compares the PSD detector design with the DCASE autoencoder baseline [2] and with log-mel statistics scored by the same Mahalanobis backend. Local-center results use 100 random calibration splits for each center size; the two 20-window rows share the same splits. Calibration windows are never scored. Offline PSD fits use canonical normalization, while the firmware export adds 10⁻⁸ to the standard deviation. The autoencoders follow the DCASE recipe without a local center, so their rows serve only as a reference point. With the same backend, the PSD front end gains 0.24 AUC over log-mel statistics. On the device it needs 0.72 s per window, while an int8 autoencoder with 45k parameters on TensorFlow Lite Micro needs 1.54 s including its log-mel front end.</w:t>
       </w:r>
     </w:p>
     <w:p>
@@ -745,7 +745,7 @@
                 <w:b/>
                 <w:sz w:val="15"/>
               </w:rPr>
-              <w:t>PSD + LW, deployed</w:t>
+              <w:t>PSD, 96 bands + LW</w:t>
             </w:r>
           </w:p>
         </w:tc>
@@ -871,7 +871,7 @@
         <w:pStyle w:val="a3"/>
       </w:pPr>
       <w:r>
-        <w:t>The firmware estimates the center and the thresholds from separate windows (Fig. 2). The trials used the GUIDED25 setting: 44 threshold windows and 22 verification windows, instead of the default 120 and 60. After at least four settling windows, three of them stable, the device records ten center windows. The coefficient of variation of their leave-one-out scores must not exceed 0.6. Up to two windows with the largest scores may be discarded, recomputing the center after each; otherwise calibration is rejected. The next 44 windows are scored against the frozen center. The entry threshold is their empirical upper 99th percentile, and the release threshold their 95th percentile kept between the median and half the entry threshold. The last 22 windows are checked with the same alarm entry and release rule, without reliability holds. A single alarm episode rejects commissioning. Including settling, this setting needs at least 80 windows, about 800 s of audio, and took 13.6 min in both trials. The center is never updated afterwards, so a slowly developing fault cannot be absorbed as normal.</w:t>
+        <w:t>The firmware estimates the center and the thresholds from separate windows (Fig. 2). The trials used the GUIDED25 setting: 44 threshold windows and 22 verification windows, instead of the default 120 and 60. After at least four settling windows, three of them stable, the device records ten center windows. The coefficient of variation of their leave-one-out scores must not exceed 0.6. Up to two windows with the largest scores may be discarded, recomputing the center after each; otherwise calibration is rejected. The next 44 windows are scored against the frozen center. The entry threshold is their empirical upper 99th percentile, and the release threshold their 95th percentile kept between the median and half the entry threshold. The last 22 windows are checked with the same alarm entry and release rule, without reliability holds. A single alarm episode rejects commissioning. Including settling, this setting needs at least 80 windows, about 800 s of audio, and took 13.6 min in both trials. The center is never updated afterwards, so a slowly developing change cannot shift this reference automatically.</w:t>
       </w:r>
     </w:p>
     <w:p>
@@ -895,7 +895,7 @@
         <w:pStyle w:val="a3"/>
       </w:pPr>
       <w:r>
-        <w:t>Every window passes four gates before it can raise an alarm. The quality gate checks the exact sample count, RMS level, peak, clipped fraction (at most 10⁻³), zero and stuck-sample fractions and a per-window count of dropped samples, which must be zero, and requires all metrics and features to be finite. A violation stops the pipeline in every phase instead of producing a score. The presence gate treats the machine as running while the window level is no more than 11 dB below the calibrated level, and as stopped after three consecutive windows below this limit. A stopped fan and a changed fan are both far from the center, and only the level separates them.</w:t>
+        <w:t>Every window passes four gates before it can raise an alarm. The quality gate checks the exact sample count, RMS level, peak, clipped fraction (at most 10⁻³), zero and stuck-sample fractions and a per-window count of dropped samples, which must be zero, and requires all metrics and features to be finite. A violation stops the pipeline in every phase instead of producing a score. The presence gate treats the machine as running while the window level is no more than 11 dB below the calibrated level, and as stopped after three consecutive windows below this limit. A stopped fan can also score highly, so this check prevents low-level windows from triggering an anomaly alarm.</w:t>
       </w:r>
     </w:p>
     <w:p>
@@ -903,7 +903,7 @@
         <w:pStyle w:val="a3"/>
       </w:pPr>
       <w:r>
-        <w:t>The reliability gate uses five sub-windows of each 10 s window, formed from the same Welch segments without extra FFTs. Its instability measure is the mean over bands of the standard deviation of the five standardized sub-window features. When a score exceeds the entry threshold and the instability exceeds 1.25 times the largest value among the ten calibration windows, the window is put on OBSERVATION_HOLD. A held window neither counts toward an alarm nor clears an active one, and it does not change the profile. Six consecutive holds raise a warning. The gate makes no claim about the cause, since one microphone cannot tell speech from a knock on the housing.</w:t>
+        <w:t>The reliability gate uses five sub-windows of each 10 s window, formed from the same Welch segments without extra FFTs. Its instability measure is the mean over bands of the standard deviation of the five standardized sub-window features. When a score exceeds the entry threshold and the instability exceeds 1.25 times the largest value among the ten calibration windows, the window is put on OBSERVATION_HOLD. A held window neither counts toward an alarm nor clears an active one, and it does not change the profile. Six consecutive holds raise a warning. The gate measures instability without identifying its cause, such as speech or a knock on the housing.</w:t>
       </w:r>
     </w:p>
     <w:p>
@@ -1807,7 +1807,7 @@
         <w:pStyle w:val="figurecaption"/>
       </w:pPr>
       <w:r>
-        <w:t>Complete sessions on the physical fan, one point per 10 s window: (a) paper strip (P), speech (S) and door (D); (b) 1 kHz tone. Shading follows operator labels, not independently measured stimulus boundaries; the tone continued beyond its shaded block. Thresholds come from DERIVE. Unconfirmed windows are excluded from Table II.</w:t>
+        <w:t>Sessions from center learning through monitoring, one point per 10 s window: (a) paper strip (P), speech (S) and door (D); (b) 1 kHz tone. Shading follows operator labels, not independently measured stimulus boundaries; the tone continued beyond its shaded block. Thresholds come from DERIVE. Unconfirmed windows are excluded from Table II.</w:t>
       </w:r>
     </w:p>
     <w:p>
@@ -1844,7 +1844,7 @@
         <w:pStyle w:val="a3"/>
       </w:pPr>
       <w:r>
-        <w:t>The tone level varied early in the trial: the 1 kHz band rose from the first tone window but briefly returned close to its normal level later. Scores crossed above and below the entry threshold, and several windows were held. At about 20.5 min both the 1 kHz band and its third harmonic at 3 kHz rose strongly. This is consistent with a level increase noted by the operator without a time stamp. The alarm then entered after three reliable windows, and the sustained-deviation event followed 130 s later. The operator marked the end of the tone at 23.3 min, but the 1 kHz band stayed about 42 standardized units above the center for another 36 windows, so the tone was still playing until about 29.4 min. After that the scores settled between 12,266 and 19,561, below the entry threshold but above the release threshold of 10,905. The alarm therefore remained active as specified by hysteresis, which requires the score to reach the lower threshold rather than a fixed waiting time. The recording ended 14 windows later without a release, so its latency was not measured. The trial confirmed tone detection, sustained-deviation reporting and the expected alarm retention.</w:t>
+        <w:t>The tone level varied early in the trial: the 1 kHz band rose from the first tone window but briefly returned close to its normal level later. Scores crossed above and below the entry threshold, and several windows were held. At about 20.5 min both the 1 kHz band and its third harmonic at 3 kHz rose strongly. This is consistent with a level increase noted by the operator without a time stamp. The alarm then entered after three reliable windows, and the sustained-deviation event followed 130 s later. The operator marked the end of the tone at 23.3 min, but the 1 kHz band stayed about 42 standardized units above the center for another 36 windows, indicating continued tonal sound until about 29.4 min. After that the scores settled between 12,266 and 19,561, below the entry threshold but above the release threshold of 10,905. The alarm therefore remained active as specified by hysteresis, which requires the score to reach the lower threshold rather than a fixed waiting time. The recording ended 14 windows later without a release, so its latency was not measured. The trial confirmed tone detection, sustained-deviation reporting and the expected alarm retention.</w:t>
       </w:r>
     </w:p>
     <w:p>
@@ -1946,7 +1946,7 @@
         <w:pStyle w:val="a3"/>
       </w:pPr>
       <w:r>
-        <w:t>First, rescoring the original recorded features reproduced the device scores within a relative error of 10⁻⁶. We then separately reset each window's band level to the calibration value and rescored it. The medians of the paper-strip blocks and of the tone change by less than 4 %, so their detection rests on spectral shape. Speech and door medians drop by 26 % and 34 % and remain several times above the entry threshold.</w:t>
+        <w:t>First, rescoring the original recorded features reproduced the device scores within a relative error of 10⁻⁶. We then separately reset each window's band level to the calibration value and rescored it. The medians of the paper-strip blocks and of the tone change by less than 4 %, indicating that their high scores mainly reflect spectral shape. Speech and door medians drop by 26 % and 34 % and remain several times above the entry threshold.</w:t>
       </w:r>
     </w:p>
     <w:p>
@@ -1954,7 +1954,7 @@
         <w:pStyle w:val="a3"/>
       </w:pPr>
       <w:r>
-        <w:t>A band map that advances every band edge by at least one bin keeps 96 bands over the same range and has no empty bands. It is level invariant by construction: the C feature changes by less than 3·10⁻⁶ for gains from 0.25 to 4, and the AUC rises to 0.878, higher in 98 of 100 splits. It needs a new precision matrix and a new commissioning, and it has not yet been tested on the fan.</w:t>
+        <w:t>A band map that advances every band edge by at least one bin keeps 96 bands over the same range and has no empty bands. It removes this source of level dependence: on six normal clips and one broadband signal, the C feature changes by less than 3·10⁻⁶ for gains from 0.25 to 4. The AUC rises to 0.878, higher in 98 of 100 splits. It needs a new precision matrix and a new commissioning, and it has not yet been tested on the fan.</w:t>
       </w:r>
     </w:p>
     <w:p>
@@ -1994,7 +1994,7 @@
         <w:pStyle w:val="a3"/>
       </w:pPr>
       <w:r>
-        <w:t>A statistical detector with a 37.6 kB model runs on the ESP32-S3 in 716 ms per 10 s window and achieves higher AUC on the DCASE fan development data than the evaluated autoencoder baselines. Physical trials demonstrated commissioning from normal sound, tone detection, sustained-deviation reporting and alarm retention consistent with hysteresis. The paper trial demonstrated alarm activation and release in one of three blocks. Replay reproduced all 180 monitoring decisions, confirming that the firmware behaved as specified in the tested installation.</w:t>
+        <w:t>A statistical detector with 37.6 kB of fixed model parameters runs on the ESP32-S3 in 716 ms per 10 s window and achieves higher AUC on the DCASE fan development data than the evaluated autoencoder baselines. Physical trials demonstrated commissioning from normal sound, tone detection, sustained-deviation reporting and alarm retention consistent with hysteresis. The paper trial demonstrated alarm activation and release in one of three blocks. Replay reproduced all 180 monitoring decisions, confirming that the firmware behaved as specified in the tested installation.</w:t>
       </w:r>
     </w:p>
     <w:p>

</xml_diff>

<commit_message>
TELFOR: zakljucak o samostalnim probama, bez AI zahvalnice
Zakljucak navodi da su samostalne probe sa dugmetom i LED-ovima,
ukljucujuci gasenje alarma poslije tona, prosle kako je predvidjeno;
ostaje samo mjerenje potrosnje na mjernoj ploci (INA226).
Zahvalnica o AI alatima je izbacena: TELFOR je ne trazi, a IEEE je
za jezicku redakciju samo preporucuje. Word i PDF ponovo izgradjeni,
i dalje 4 A4 strane.

Co-Authored-By: Claude Opus 5.5 <noreply@anthropic.com>
Claude-Session: https://claude.ai/code/session_01DFDGGJbfQb8ZrCu2ZZJucC
</commit_message>
<xml_diff>
--- a/radovi/telfor2026/telfor2026_asd_esp32s3.docx
+++ b/radovi/telfor2026/telfor2026_asd_esp32s3.docx
@@ -2002,27 +2002,7 @@
         <w:pStyle w:val="a3"/>
       </w:pPr>
       <w:r>
-        <w:t>The evidence comes from one fan, one room and two sessions, and both stimuli were induced changes; no mechanical fault was tested. The paper protocol did not meet its predefined detection and recovery criteria. Final release after the tone, power consumption and standalone operation with the button and LEDs remain unmeasured. Further work should repeat the paper trial with a fixed holder, test the level-invariant band map on hardware and assess detection of unsteady changes in independent installations.</w:t>
-      </w:r>
-    </w:p>
-    <w:p>
-      <w:pPr>
-        <w:pStyle w:val="1"/>
-        <w:numPr>
-          <w:ilvl w:val="0"/>
-          <w:numId w:val="0"/>
-        </w:numPr>
-      </w:pPr>
-      <w:r>
-        <w:t>Acknowledgment</w:t>
-      </w:r>
-    </w:p>
-    <w:p>
-      <w:pPr>
-        <w:pStyle w:val="a3"/>
-      </w:pPr>
-      <w:r>
-        <w:t>Generative AI tools (OpenAI Codex and Anthropic Claude) were used for language editing and for checking tables and figures against the recorded measurement files. All reported values are computed from the retained measurement artifacts.</w:t>
+        <w:t>The evidence comes from one fan, one room and two sessions, and both stimuli were induced changes; no mechanical fault was tested. The paper protocol did not meet its predefined detection and recovery criteria. Later standalone tests with the push-button and LEDs confirmed operation as intended, including alarm release after the tone; only power consumption remains to be measured, with a dedicated INA226 measurement board. Further work should repeat the paper trial with a fixed holder, test the level-invariant band map on hardware and assess detection of unsteady changes in independent installations.</w:t>
       </w:r>
     </w:p>
     <w:p>

</xml_diff>